<commit_message>
feat: definir modelos para cada IA separadamente e implementar serviço para compra de crédito avulso
</commit_message>
<xml_diff>
--- a/services/worker/src/assets/templates/cnis_report.docx
+++ b/services/worker/src/assets/templates/cnis_report.docx
@@ -84,14 +84,9 @@
       </w:r>
       <w:proofErr w:type="spellStart"/>
       <w:r>
-        <w:t>data_</w:t>
-      </w:r>
-      <w:proofErr w:type="gramStart"/>
-      <w:r>
-        <w:t>analise</w:t>
+        <w:t>data_analise</w:t>
       </w:r>
       <w:proofErr w:type="spellEnd"/>
-      <w:proofErr w:type="gramEnd"/>
       <w:r>
         <w:t>}}</w:t>
       </w:r>
@@ -524,7 +519,6 @@
                 <w14:ligatures w14:val="none"/>
               </w:rPr>
             </w:pPr>
-            <w:proofErr w:type="gramStart"/>
             <w:r>
               <w:rPr>
                 <w:rFonts w:eastAsia="Times New Roman" w:cs="Times New Roman"/>
@@ -548,20 +542,7 @@
                 <w:lang w:eastAsia="pt-BR"/>
                 <w14:ligatures w14:val="none"/>
               </w:rPr>
-              <w:t>v</w:t>
-            </w:r>
-            <w:proofErr w:type="gramEnd"/>
-            <w:r>
-              <w:rPr>
-                <w:rFonts w:eastAsia="Times New Roman" w:cs="Times New Roman"/>
-                <w:color w:val="000000"/>
-                <w:kern w:val="0"/>
-                <w:sz w:val="22"/>
-                <w:szCs w:val="22"/>
-                <w:lang w:eastAsia="pt-BR"/>
-                <w14:ligatures w14:val="none"/>
-              </w:rPr>
-              <w:t>.empresa</w:t>
+              <w:t>v.empresa</w:t>
             </w:r>
             <w:proofErr w:type="spellEnd"/>
             <w:r>
@@ -603,7 +584,6 @@
                 <w14:ligatures w14:val="none"/>
               </w:rPr>
             </w:pPr>
-            <w:proofErr w:type="gramStart"/>
             <w:r>
               <w:rPr>
                 <w:rFonts w:eastAsia="Times New Roman" w:cs="Times New Roman"/>
@@ -627,60 +607,20 @@
                 <w:lang w:eastAsia="pt-BR"/>
                 <w14:ligatures w14:val="none"/>
               </w:rPr>
-              <w:t>v</w:t>
-            </w:r>
-            <w:proofErr w:type="gramEnd"/>
-            <w:r>
-              <w:rPr>
-                <w:rFonts w:eastAsia="Times New Roman" w:cs="Times New Roman"/>
-                <w:color w:val="000000"/>
-                <w:kern w:val="0"/>
-                <w:sz w:val="22"/>
-                <w:szCs w:val="22"/>
-                <w:lang w:eastAsia="pt-BR"/>
-                <w14:ligatures w14:val="none"/>
-              </w:rPr>
-              <w:t>.</w:t>
-            </w:r>
-            <w:proofErr w:type="gramStart"/>
-            <w:r>
-              <w:rPr>
-                <w:rFonts w:eastAsia="Times New Roman" w:cs="Times New Roman"/>
-                <w:color w:val="000000"/>
-                <w:kern w:val="0"/>
-                <w:sz w:val="22"/>
-                <w:szCs w:val="22"/>
-                <w:lang w:eastAsia="pt-BR"/>
-                <w14:ligatures w14:val="none"/>
-              </w:rPr>
-              <w:t>periodo.inicio</w:t>
+              <w:t>v.periodo.inicio</w:t>
             </w:r>
             <w:proofErr w:type="spellEnd"/>
-            <w:proofErr w:type="gramEnd"/>
-            <w:r>
-              <w:rPr>
-                <w:rFonts w:eastAsia="Times New Roman" w:cs="Times New Roman"/>
-                <w:color w:val="000000"/>
-                <w:kern w:val="0"/>
-                <w:sz w:val="22"/>
-                <w:szCs w:val="22"/>
-                <w:lang w:eastAsia="pt-BR"/>
-                <w14:ligatures w14:val="none"/>
-              </w:rPr>
-              <w:t xml:space="preserve"> }} – </w:t>
-            </w:r>
-            <w:proofErr w:type="gramStart"/>
-            <w:r>
-              <w:rPr>
-                <w:rFonts w:eastAsia="Times New Roman" w:cs="Times New Roman"/>
-                <w:color w:val="000000"/>
-                <w:kern w:val="0"/>
-                <w:sz w:val="22"/>
-                <w:szCs w:val="22"/>
-                <w:lang w:eastAsia="pt-BR"/>
-                <w14:ligatures w14:val="none"/>
-              </w:rPr>
-              <w:t xml:space="preserve">{{ </w:t>
+            <w:r>
+              <w:rPr>
+                <w:rFonts w:eastAsia="Times New Roman" w:cs="Times New Roman"/>
+                <w:color w:val="000000"/>
+                <w:kern w:val="0"/>
+                <w:sz w:val="22"/>
+                <w:szCs w:val="22"/>
+                <w:lang w:eastAsia="pt-BR"/>
+                <w14:ligatures w14:val="none"/>
+              </w:rPr>
+              <w:t xml:space="preserve"> }} – {{ </w:t>
             </w:r>
             <w:proofErr w:type="spellStart"/>
             <w:r>
@@ -696,7 +636,6 @@
               <w:t>v.periodo.fim</w:t>
             </w:r>
             <w:proofErr w:type="spellEnd"/>
-            <w:proofErr w:type="gramEnd"/>
             <w:r>
               <w:rPr>
                 <w:rFonts w:eastAsia="Times New Roman" w:cs="Times New Roman"/>
@@ -737,7 +676,6 @@
                 <w14:ligatures w14:val="none"/>
               </w:rPr>
             </w:pPr>
-            <w:proofErr w:type="gramStart"/>
             <w:r>
               <w:rPr>
                 <w:rFonts w:eastAsia="Times New Roman" w:cs="Times New Roman"/>
@@ -761,20 +699,7 @@
                 <w:lang w:eastAsia="pt-BR"/>
                 <w14:ligatures w14:val="none"/>
               </w:rPr>
-              <w:t>v</w:t>
-            </w:r>
-            <w:proofErr w:type="gramEnd"/>
-            <w:r>
-              <w:rPr>
-                <w:rFonts w:eastAsia="Times New Roman" w:cs="Times New Roman"/>
-                <w:color w:val="000000"/>
-                <w:kern w:val="0"/>
-                <w:sz w:val="22"/>
-                <w:szCs w:val="22"/>
-                <w:lang w:eastAsia="pt-BR"/>
-                <w14:ligatures w14:val="none"/>
-              </w:rPr>
-              <w:t>.indicadores</w:t>
+              <w:t>v.indicadores</w:t>
             </w:r>
             <w:proofErr w:type="spellEnd"/>
             <w:r>
@@ -790,7 +715,6 @@
               <w:t xml:space="preserve"> | </w:t>
             </w:r>
             <w:proofErr w:type="spellStart"/>
-            <w:proofErr w:type="gramStart"/>
             <w:r>
               <w:rPr>
                 <w:rFonts w:eastAsia="Times New Roman" w:cs="Times New Roman"/>
@@ -814,20 +738,7 @@
                 <w:lang w:eastAsia="pt-BR"/>
                 <w14:ligatures w14:val="none"/>
               </w:rPr>
-              <w:t>(</w:t>
-            </w:r>
-            <w:proofErr w:type="gramEnd"/>
-            <w:r>
-              <w:rPr>
-                <w:rFonts w:eastAsia="Times New Roman" w:cs="Times New Roman"/>
-                <w:color w:val="000000"/>
-                <w:kern w:val="0"/>
-                <w:sz w:val="22"/>
-                <w:szCs w:val="22"/>
-                <w:lang w:eastAsia="pt-BR"/>
-                <w14:ligatures w14:val="none"/>
-              </w:rPr>
-              <w:t>", ") }}</w:t>
+              <w:t>(", ") }}</w:t>
             </w:r>
           </w:p>
         </w:tc>
@@ -856,7 +767,6 @@
                 <w14:ligatures w14:val="none"/>
               </w:rPr>
             </w:pPr>
-            <w:proofErr w:type="gramStart"/>
             <w:r>
               <w:rPr>
                 <w:rFonts w:eastAsia="Times New Roman" w:cs="Times New Roman"/>
@@ -880,46 +790,7 @@
                 <w:lang w:eastAsia="pt-BR"/>
                 <w14:ligatures w14:val="none"/>
               </w:rPr>
-              <w:t>v</w:t>
-            </w:r>
-            <w:proofErr w:type="gramEnd"/>
-            <w:r>
-              <w:rPr>
-                <w:rFonts w:eastAsia="Times New Roman" w:cs="Times New Roman"/>
-                <w:color w:val="000000"/>
-                <w:kern w:val="0"/>
-                <w:sz w:val="22"/>
-                <w:szCs w:val="22"/>
-                <w:lang w:eastAsia="pt-BR"/>
-                <w14:ligatures w14:val="none"/>
-              </w:rPr>
-              <w:t>.</w:t>
-            </w:r>
-            <w:proofErr w:type="gramStart"/>
-            <w:r>
-              <w:rPr>
-                <w:rFonts w:eastAsia="Times New Roman" w:cs="Times New Roman"/>
-                <w:color w:val="000000"/>
-                <w:kern w:val="0"/>
-                <w:sz w:val="22"/>
-                <w:szCs w:val="22"/>
-                <w:lang w:eastAsia="pt-BR"/>
-                <w14:ligatures w14:val="none"/>
-              </w:rPr>
-              <w:t>analise</w:t>
-            </w:r>
-            <w:proofErr w:type="gramEnd"/>
-            <w:r>
-              <w:rPr>
-                <w:rFonts w:eastAsia="Times New Roman" w:cs="Times New Roman"/>
-                <w:color w:val="000000"/>
-                <w:kern w:val="0"/>
-                <w:sz w:val="22"/>
-                <w:szCs w:val="22"/>
-                <w:lang w:eastAsia="pt-BR"/>
-                <w14:ligatures w14:val="none"/>
-              </w:rPr>
-              <w:t>_critica</w:t>
+              <w:t>v.analise_critica</w:t>
             </w:r>
             <w:proofErr w:type="spellEnd"/>
             <w:r>
@@ -1113,15 +984,7 @@
       </w:r>
       <w:proofErr w:type="spellStart"/>
       <w:r>
-        <w:t>maior_</w:t>
-      </w:r>
-      <w:proofErr w:type="gramStart"/>
-      <w:r>
-        <w:t>salario</w:t>
-      </w:r>
-      <w:proofErr w:type="gramEnd"/>
-      <w:r>
-        <w:t>_contribuicao</w:t>
+        <w:t>maior_salario_contribuicao</w:t>
       </w:r>
       <w:proofErr w:type="spellEnd"/>
       <w:r>
@@ -1156,29 +1019,19 @@
           <w:numId w:val="1"/>
         </w:numPr>
       </w:pPr>
-      <w:proofErr w:type="gramStart"/>
-      <w:r>
-        <w:t xml:space="preserve">{{ </w:t>
+      <w:r>
+        <w:t>{{</w:t>
       </w:r>
       <w:proofErr w:type="spellStart"/>
       <w:r>
         <w:t>i</w:t>
       </w:r>
-      <w:proofErr w:type="gramEnd"/>
-      <w:r>
-        <w:t>.</w:t>
-      </w:r>
-      <w:proofErr w:type="gramStart"/>
-      <w:r>
-        <w:t>codigo</w:t>
+      <w:r>
+        <w:t>.codigo</w:t>
       </w:r>
       <w:proofErr w:type="spellEnd"/>
       <w:r>
-        <w:t xml:space="preserve"> }</w:t>
-      </w:r>
-      <w:proofErr w:type="gramEnd"/>
-      <w:r>
-        <w:t>}</w:t>
+        <w:t>}}</w:t>
       </w:r>
     </w:p>
     <w:p>
@@ -1190,31 +1043,15 @@
         </w:numPr>
       </w:pPr>
       <w:r>
-        <w:t xml:space="preserve">Descrição: </w:t>
-      </w:r>
-      <w:proofErr w:type="gramStart"/>
-      <w:r>
-        <w:t xml:space="preserve">{{ </w:t>
+        <w:t>Descrição: {{</w:t>
       </w:r>
       <w:proofErr w:type="spellStart"/>
       <w:r>
-        <w:t>i</w:t>
-      </w:r>
-      <w:proofErr w:type="gramEnd"/>
-      <w:r>
-        <w:t>.</w:t>
-      </w:r>
-      <w:proofErr w:type="gramStart"/>
-      <w:r>
-        <w:t>descricao</w:t>
+        <w:t>i.descricao</w:t>
       </w:r>
       <w:proofErr w:type="spellEnd"/>
       <w:r>
-        <w:t xml:space="preserve"> }</w:t>
-      </w:r>
-      <w:proofErr w:type="gramEnd"/>
-      <w:r>
-        <w:t>}</w:t>
+        <w:t>}}</w:t>
       </w:r>
     </w:p>
     <w:p>
@@ -1226,31 +1063,15 @@
         </w:numPr>
       </w:pPr>
       <w:r>
-        <w:t xml:space="preserve">Implicação: </w:t>
-      </w:r>
-      <w:proofErr w:type="gramStart"/>
-      <w:r>
-        <w:t xml:space="preserve">{{ </w:t>
+        <w:t>Implicação: {{</w:t>
       </w:r>
       <w:proofErr w:type="spellStart"/>
       <w:r>
-        <w:t>i</w:t>
-      </w:r>
-      <w:proofErr w:type="gramEnd"/>
-      <w:r>
-        <w:t>.</w:t>
-      </w:r>
-      <w:proofErr w:type="gramStart"/>
-      <w:r>
-        <w:t>implicacao</w:t>
+        <w:t>i.implicacao</w:t>
       </w:r>
       <w:proofErr w:type="spellEnd"/>
       <w:r>
-        <w:t xml:space="preserve"> }</w:t>
-      </w:r>
-      <w:proofErr w:type="gramEnd"/>
-      <w:r>
-        <w:t>}</w:t>
+        <w:t>}}</w:t>
       </w:r>
     </w:p>
     <w:p>
@@ -1302,15 +1123,7 @@
     </w:p>
     <w:p>
       <w:r>
-        <w:t xml:space="preserve">• </w:t>
-      </w:r>
-      <w:proofErr w:type="gramStart"/>
-      <w:r>
-        <w:t>{{ a</w:t>
-      </w:r>
-      <w:proofErr w:type="gramEnd"/>
-      <w:r>
-        <w:t xml:space="preserve"> }}</w:t>
+        <w:t>• {{a}}</w:t>
       </w:r>
     </w:p>
     <w:p>
@@ -1432,7 +1245,6 @@
       <w:t xml:space="preserve"> </w:t>
     </w:r>
     <w:proofErr w:type="spellStart"/>
-    <w:proofErr w:type="gramStart"/>
     <w:r>
       <w:rPr>
         <w:i/>
@@ -1450,17 +1262,7 @@
         <w:sz w:val="18"/>
         <w:szCs w:val="18"/>
       </w:rPr>
-      <w:t xml:space="preserve"> Processa</w:t>
-    </w:r>
-    <w:proofErr w:type="gramEnd"/>
-    <w:r>
-      <w:rPr>
-        <w:i/>
-        <w:iCs/>
-        <w:sz w:val="18"/>
-        <w:szCs w:val="18"/>
-      </w:rPr>
-      <w:t xml:space="preserve"> AI</w:t>
+      <w:t xml:space="preserve"> Processa AI</w:t>
     </w:r>
   </w:p>
   <w:p>

</xml_diff>